<commit_message>
Docs: no fixed treat prices + buff/balance updates; refresh .docx
Co-Authored-By: Claude Opus 4.8 (1M context) <noreply@anthropic.com>
</commit_message>
<xml_diff>
--- a/LOGIC.docx
+++ b/LOGIC.docx
@@ -1790,24 +1790,10 @@
         <w:rPr>
           <w:b/>
         </w:rPr>
-        <w:t>It can go negative</w:t>
+        <w:t>You can only spend what you've banked</w:t>
       </w:r>
       <w:r>
-        <w:t xml:space="preserve"> ("in the red — earn it back"); spending is never blocked.</w:t>
-      </w:r>
-    </w:p>
-    <w:p>
-      <w:pPr>
-        <w:pStyle w:val="ListBullet"/>
-      </w:pPr>
-      <w:r>
-        <w:rPr>
-          <w:b/>
-        </w:rPr>
-        <w:t>"Available now"</w:t>
-      </w:r>
-      <w:r>
-        <w:t xml:space="preserve"> shows what your balance can afford (e.g. ☕×6).</w:t>
+        <w:t xml:space="preserve"> — no negative balance.</w:t>
       </w:r>
     </w:p>
     <w:p>
@@ -2045,7 +2031,7 @@
         <w:pStyle w:val="Heading2"/>
       </w:pPr>
       <w:r>
-        <w:t>Spending</w:t>
+        <w:t>Spending (you set the amount)</w:t>
       </w:r>
     </w:p>
     <w:p>
@@ -2056,10 +2042,19 @@
         <w:rPr>
           <w:b/>
         </w:rPr>
-        <w:t>Quick treats</w:t>
+        <w:t>No fixed prices.</w:t>
       </w:r>
       <w:r>
-        <w:t xml:space="preserve"> (fixed price): ☕ Coffee ₹100 · 🍰 Sweet Treat ₹150 · 🥟 Momos ₹250 · 🍔 Meal ₹500.</w:t>
+        <w:t xml:space="preserve"> Tap a chip (☕ Coffee · 🍰 Sweet Treat · 🥟 Momos · 🍔 Meal · 🛍️ Shopping · 💇 Salon · ✈️ Trip · ✨ Other) to fill the label, then </w:t>
+      </w:r>
+      <w:r>
+        <w:rPr>
+          <w:b/>
+        </w:rPr>
+        <w:t>type the real ₹ you actually spent</w:t>
+      </w:r>
+      <w:r>
+        <w:t xml:space="preserve"> and hit Spend.</w:t>
       </w:r>
     </w:p>
     <w:p>
@@ -2070,10 +2065,10 @@
         <w:rPr>
           <w:b/>
         </w:rPr>
-        <w:t>Spend an exact amount</w:t>
+        <w:t>Earn then spend:</w:t>
       </w:r>
       <w:r>
-        <w:t xml:space="preserve"> (free-form): type the real ₹ of any treat + what for (Shopping/Salon/Trip/Other). Debits that exact amount.</w:t>
+        <w:t xml:space="preserve"> you can only spend what you've banked — no overspending or going negative.</w:t>
       </w:r>
     </w:p>
     <w:p>
@@ -2162,15 +2157,6 @@
         <w:rPr>
           <w:b/>
         </w:rPr>
-        <w:t>Coffee costs half</w:t>
-      </w:r>
-      <w:r>
-        <w:t xml:space="preserve"> · </w:t>
-      </w:r>
-      <w:r>
-        <w:rPr>
-          <w:b/>
-        </w:rPr>
         <w:t>Reading pays +₹100</w:t>
       </w:r>
       <w:r>
@@ -2190,6 +2176,15 @@
           <w:b/>
         </w:rPr>
         <w:t>+₹50 if you win</w:t>
+      </w:r>
+      <w:r>
+        <w:t xml:space="preserve"> · </w:t>
+      </w:r>
+      <w:r>
+        <w:rPr>
+          <w:b/>
+        </w:rPr>
+        <w:t>Gym/steps pays +₹75</w:t>
       </w:r>
       <w:r>
         <w:t>.</w:t>

</xml_diff>